<commit_message>
Align Fall 2026 course materials with Oct 13 wing fabrication launch
</commit_message>
<xml_diff>
--- a/docs/MIE_446_Aerospace_Structures_Fall_2026_Syllabus_Updated.docx
+++ b/docs/MIE_446_Aerospace_Structures_Fall_2026_Syllabus_Updated.docx
@@ -17,6 +17,7 @@
     </w:p>
     <w:p>
       <w:pPr>
+        <w:pStyle w:val="Title"/>
         <w:spacing w:after="40"/>
         <w:jc w:val="both"/>
       </w:pPr>
@@ -25,7 +26,7 @@
           <w:b/>
           <w:sz w:val="48"/>
         </w:rPr>
-        <w:t>AEROSPACE STRUCTURES</w:t>
+        <w:t>Aerospace Structures Fall 2026 Syllabus</w:t>
       </w:r>
     </w:p>
     <w:p>
@@ -38,7 +39,7 @@
           <w:i/>
           <w:sz w:val="22"/>
         </w:rPr>
-        <w:t>Fall 2026 - Student Syllabus</w:t>
+        <w:t>Revised September 26 2026</w:t>
       </w:r>
     </w:p>
     <w:tbl>
@@ -2875,19 +2876,7 @@
         <w:rPr>
           <w:sz w:val="18"/>
         </w:rPr>
-        <w:t>The midterm is individual and closed to generative AI and unauthorized online assistance</w:t>
-      </w:r>
-      <w:r>
-        <w:rPr>
-          <w:sz w:val="18"/>
-        </w:rPr>
-        <w:t xml:space="preserve"> but open to any other resources</w:t>
-      </w:r>
-      <w:r>
-        <w:rPr>
-          <w:sz w:val="18"/>
-        </w:rPr>
-        <w:t xml:space="preserve">. </w:t>
+        <w:t>The midterm on October 27 is individual and closed to generative AI and unauthorized online assistance but open to other permitted resources. It covers material taught through October 22; the detailed scope and practice problems will be posted in Canvas.</w:t>
       </w:r>
     </w:p>
     <w:p>
@@ -3805,7 +3794,7 @@
         <w:jc w:val="both"/>
       </w:pPr>
       <w:r>
-        <w:t>Team formation</w:t>
+        <w:t>Assigned project teams</w:t>
       </w:r>
     </w:p>
     <w:p>
@@ -3819,7 +3808,7 @@
         <w:rPr>
           <w:sz w:val="18"/>
         </w:rPr>
-        <w:t>Students will form teams of three; roles rotate among geometry/code and verification, CAD/design-for-additive-manufacturing, fabrication and build documentation, and measurement/data interpretation. All members must understand the complete workflow and answer individual technical questions.</w:t>
+        <w:t>Three-person teams have already been assigned. The wing project begins in class on September 29. Roles rotate among geometry and verification, CAD and design for additive manufacturing, fabrication and documentation, and measurement and data interpretation. Every member must understand the complete workflow and answer individual technical questions.</w:t>
       </w:r>
     </w:p>
     <w:p>
@@ -4019,25 +4008,7 @@
               <w:rPr>
                 <w:sz w:val="16"/>
               </w:rPr>
-              <w:t>Semi-span 450 mm; root chord 160 mm; tip chord 100 mm; NACA 4-digit section</w:t>
-            </w:r>
-            <w:r>
-              <w:rPr>
-                <w:sz w:val="16"/>
-              </w:rPr>
-              <w:t xml:space="preserve"> (or other </w:t>
-            </w:r>
-            <w:r>
-              <w:rPr>
-                <w:sz w:val="16"/>
-              </w:rPr>
-              <w:t>profiles</w:t>
-            </w:r>
-            <w:r>
-              <w:rPr>
-                <w:sz w:val="16"/>
-              </w:rPr>
-              <w:t>)</w:t>
+              <w:t>One 450 mm semi-wing; 160 mm root chord; 100 mm tip chord; an instructor-approved NACA four-digit section. The full-wing area and aspect ratio are analytical mirrored-wing equivalents.</w:t>
             </w:r>
           </w:p>
         </w:tc>
@@ -4093,7 +4064,7 @@
               <w:rPr>
                 <w:sz w:val="16"/>
               </w:rPr>
-              <w:t>Three or fewer printed modules; printed shell/ribs with interfaces for course-issued carbon-fiber rods</w:t>
+              <w:t>Two or three printed modules; shell and ribs; two course-issued 4 mm rods at x/c = 0.30 and 0.60 in the released guided notebook. Any departure requires instructor approval before print release.</w:t>
             </w:r>
           </w:p>
         </w:tc>
@@ -4420,7 +4391,7 @@
           <w:bCs/>
           <w:highlight w:val="yellow"/>
         </w:rPr>
-        <w:t>Important: The instructor provides the baseline wing-generation and Jetson/OpenCV/data-acquisition code. Students configure, run, verify, explain, and defend it; writing the full code from scratch is not required. AI tools remain permitted with disclosure and verification.</w:t>
+        <w:t>The instructor provides the guided Python/CadQuery wing-generation notebook and the Jetson/OpenCV/data-acquisition workflows. Teams configure, run, verify, explain, and defend these tools; writing a CAD kernel from scratch is not required. AI use remains permitted with disclosure and an independent check.</w:t>
       </w:r>
     </w:p>
     <w:p>
@@ -4428,6 +4399,9 @@
         <w:spacing w:after="40"/>
         <w:jc w:val="both"/>
       </w:pPr>
+      <w:r>
+        <w:t>Fabrication starts on Tuesday, October 13, in assigned, supervised ELab slots. A team may release its first wing module only after a physical rod-fit coupon, a documented calculation check, a clean notebook run, a slicer review, and staff print approval. October 13 is a production start, not a promise that all 21 teams will finish printing that day.</w:t>
+      </w:r>
     </w:p>
     <w:p>
       <w:pPr>
@@ -5078,7 +5052,7 @@
               <w:rPr>
                 <w:sz w:val="17"/>
               </w:rPr>
-              <w:t>Sept. 17</w:t>
+              <w:t>Sept. 22</w:t>
             </w:r>
           </w:p>
         </w:tc>
@@ -5103,7 +5077,7 @@
               <w:rPr>
                 <w:sz w:val="17"/>
               </w:rPr>
-              <w:t>Teams formations</w:t>
+              <w:t>Three-person teams already assigned; project roles and shared folders confirmed.</w:t>
             </w:r>
           </w:p>
         </w:tc>
@@ -5134,7 +5108,7 @@
               <w:rPr>
                 <w:sz w:val="17"/>
               </w:rPr>
-              <w:t>Oct. 15</w:t>
+              <w:t>Sept. 29-Oct. 1</w:t>
             </w:r>
           </w:p>
         </w:tc>
@@ -5159,7 +5133,7 @@
               <w:rPr>
                 <w:sz w:val="17"/>
               </w:rPr>
-              <w:t>Code checkpoint: parameterized airfoil/wing, planform metrics, unit/sanity and bounding-box checks; review of instructor-provided inspection workflow</w:t>
+              <w:t>Project launch and manual geometry, planform, and load-path calculations.</w:t>
             </w:r>
           </w:p>
         </w:tc>
@@ -5190,7 +5164,7 @@
               <w:rPr>
                 <w:sz w:val="17"/>
               </w:rPr>
-              <w:t>Oct. 22</w:t>
+              <w:t>Oct. 6-8</w:t>
             </w:r>
           </w:p>
         </w:tc>
@@ -5215,7 +5189,7 @@
               <w:rPr>
                 <w:sz w:val="17"/>
               </w:rPr>
-              <w:t>Design review: geometry, interfaces, code verification, print-risk register, and draft manual/vision measurement plan</w:t>
+              <w:t>Supervised coupon-only run, physical fit test, rod measurement, and R01 record. Staff schedules the short coupon appointments.</w:t>
             </w:r>
           </w:p>
         </w:tc>
@@ -5246,7 +5220,7 @@
               <w:rPr>
                 <w:sz w:val="17"/>
               </w:rPr>
-              <w:t>Nov. 12</w:t>
+              <w:t>Oct. 8-9</w:t>
             </w:r>
           </w:p>
         </w:tc>
@@ -5271,7 +5245,7 @@
               <w:rPr>
                 <w:sz w:val="17"/>
               </w:rPr>
-              <w:t>Print-readiness review: frozen STL/3MF, every-layer preview, mass/time budget, assembly plan, and inspection target placement</w:t>
+              <w:t>Pre-print review: calculation sheet, coupon evidence, R02 clean run, module dimensions, CAD mass, all-layer slicer review, safety training, and assigned printer slot.</w:t>
             </w:r>
           </w:p>
         </w:tc>
@@ -5302,7 +5276,7 @@
               <w:rPr>
                 <w:sz w:val="17"/>
               </w:rPr>
-              <w:t>Nov. 19</w:t>
+              <w:t>Oct. 13</w:t>
             </w:r>
           </w:p>
         </w:tc>
@@ -5327,7 +5301,7 @@
               <w:rPr>
                 <w:sz w:val="17"/>
               </w:rPr>
-              <w:t>Team-specific fabrication and assembly slots; exact reservations are posted in Canvas</w:t>
+              <w:t>Supervised wing-module fabrication begins for released teams. Teams without a passed coupon or release work on the missing gate, not a final wing print.</w:t>
             </w:r>
           </w:p>
         </w:tc>
@@ -5358,7 +5332,7 @@
               <w:rPr>
                 <w:sz w:val="17"/>
               </w:rPr>
-              <w:t>Nov. 20–Dec. 3</w:t>
+              <w:t>Oct. 22</w:t>
             </w:r>
           </w:p>
         </w:tc>
@@ -5383,7 +5357,7 @@
               <w:rPr>
                 <w:sz w:val="17"/>
               </w:rPr>
-              <w:t>Manual and Jetson-camera inspection, build acceptance, shared damage-diagnostics demonstration/data analysis, authorized revision or reprint, and final evidence archive</w:t>
+              <w:t>Reproducibility and as-built checkpoint: parameter trace, file/revision consistency, print log, independent check, and current risks.</w:t>
             </w:r>
           </w:p>
         </w:tc>
@@ -5414,7 +5388,7 @@
               <w:rPr>
                 <w:sz w:val="17"/>
               </w:rPr>
-              <w:t>Dec. 3–8</w:t>
+              <w:t>Oct. 26; Nov. 2</w:t>
             </w:r>
           </w:p>
         </w:tc>
@@ -5439,7 +5413,7 @@
               <w:rPr>
                 <w:sz w:val="17"/>
               </w:rPr>
-              <w:t>Project presentations, diagnostic evidence synthesis, and individual technical questions</w:t>
+              <w:t>Follow-up ELab slots for remaining modules, authorized corrections or reprints, and dimensional checks; reservations and machine capacity are posted in Canvas.</w:t>
             </w:r>
           </w:p>
         </w:tc>
@@ -5470,6 +5444,118 @@
               <w:rPr>
                 <w:sz w:val="17"/>
               </w:rPr>
+              <w:t>Nov. 12; Nov. 16</w:t>
+            </w:r>
+          </w:p>
+        </w:tc>
+        <w:tc>
+          <w:tcPr>
+            <w:tcW w:w="7992" w:type="dxa"/>
+            <w:shd w:val="clear" w:color="auto" w:fill="FFFFFF"/>
+            <w:tcMar>
+              <w:top w:w="70" w:type="dxa"/>
+              <w:left w:w="90" w:type="dxa"/>
+              <w:bottom w:w="70" w:type="dxa"/>
+              <w:right w:w="90" w:type="dxa"/>
+            </w:tcMar>
+            <w:vAlign w:val="center"/>
+          </w:tcPr>
+          <w:p>
+            <w:pPr>
+              <w:spacing w:after="0" w:line="240" w:lineRule="auto"/>
+              <w:jc w:val="both"/>
+            </w:pPr>
+            <w:r>
+              <w:rPr>
+                <w:sz w:val="17"/>
+              </w:rPr>
+              <w:t>Design and assembly review, dry fit, alignment plan, supervised assembly or authorized correction, and early manual inspection.</w:t>
+            </w:r>
+          </w:p>
+        </w:tc>
+      </w:tr>
+      <w:tr>
+        <w:trPr>
+          <w:cantSplit/>
+          <w:jc w:val="center"/>
+        </w:trPr>
+        <w:tc>
+          <w:tcPr>
+            <w:tcW w:w="2232" w:type="dxa"/>
+            <w:shd w:val="clear" w:color="auto" w:fill="FFFFFF"/>
+            <w:tcMar>
+              <w:top w:w="70" w:type="dxa"/>
+              <w:left w:w="90" w:type="dxa"/>
+              <w:bottom w:w="70" w:type="dxa"/>
+              <w:right w:w="90" w:type="dxa"/>
+            </w:tcMar>
+            <w:vAlign w:val="center"/>
+          </w:tcPr>
+          <w:p>
+            <w:pPr>
+              <w:spacing w:after="0" w:line="240" w:lineRule="auto"/>
+              <w:jc w:val="both"/>
+            </w:pPr>
+            <w:r>
+              <w:rPr>
+                <w:sz w:val="17"/>
+              </w:rPr>
+              <w:t>Dec. 1-3</w:t>
+            </w:r>
+          </w:p>
+        </w:tc>
+        <w:tc>
+          <w:tcPr>
+            <w:tcW w:w="7992" w:type="dxa"/>
+            <w:shd w:val="clear" w:color="auto" w:fill="FFFFFF"/>
+            <w:tcMar>
+              <w:top w:w="70" w:type="dxa"/>
+              <w:left w:w="90" w:type="dxa"/>
+              <w:bottom w:w="70" w:type="dxa"/>
+              <w:right w:w="90" w:type="dxa"/>
+            </w:tcMar>
+            <w:vAlign w:val="center"/>
+          </w:tcPr>
+          <w:p>
+            <w:pPr>
+              <w:spacing w:after="0" w:line="240" w:lineRule="auto"/>
+              <w:jc w:val="both"/>
+            </w:pPr>
+            <w:r>
+              <w:rPr>
+                <w:sz w:val="17"/>
+              </w:rPr>
+              <w:t>Build acceptance and calibrated manual/Jetson inspection; shared damage-diagnostics demonstration and data analysis.</w:t>
+            </w:r>
+          </w:p>
+        </w:tc>
+      </w:tr>
+      <w:tr>
+        <w:trPr>
+          <w:cantSplit/>
+          <w:jc w:val="center"/>
+        </w:trPr>
+        <w:tc>
+          <w:tcPr>
+            <w:tcW w:w="2232" w:type="dxa"/>
+            <w:shd w:val="clear" w:color="auto" w:fill="FFFFFF"/>
+            <w:tcMar>
+              <w:top w:w="70" w:type="dxa"/>
+              <w:left w:w="90" w:type="dxa"/>
+              <w:bottom w:w="70" w:type="dxa"/>
+              <w:right w:w="90" w:type="dxa"/>
+            </w:tcMar>
+            <w:vAlign w:val="center"/>
+          </w:tcPr>
+          <w:p>
+            <w:pPr>
+              <w:spacing w:after="0" w:line="240" w:lineRule="auto"/>
+              <w:jc w:val="both"/>
+            </w:pPr>
+            <w:r>
+              <w:rPr>
+                <w:sz w:val="17"/>
+              </w:rPr>
               <w:t>Dec. 8, 10, 15</w:t>
             </w:r>
           </w:p>
@@ -5495,7 +5581,7 @@
               <w:rPr>
                 <w:sz w:val="17"/>
               </w:rPr>
-              <w:t>Final report, configured code/archive, manufacturing files, print log, annotated inspection image/CSV, diagnostic analysis, and acceptance evidence due</w:t>
+              <w:t>Team presentations and individual technical questions; final package due Dec. 15 at 5:00 p.m.</w:t>
             </w:r>
           </w:p>
         </w:tc>
@@ -6571,7 +6657,359 @@
         <w:rPr>
           <w:sz w:val="18"/>
         </w:rPr>
-        <w:t>Dates and topics below are the working instructional sequence. Canvas will carry the authoritative assignment files and printer sign-ups. Material may shift by one meeting to support learning, but graded due dates will not move earlier without consent.</w:t>
+        <w:t>The four 75-minute meetings before fabrication are specified below. October 12 is a University holiday; there is no regular class that day. Coupon appointments outside class require ELab authorization and supervision. The revised due dates below supersede the earlier syllabus schedule; Canvas provides submission links and team-specific printer reservations. No team may bypass a safety or print-release condition because of the accelerated calendar.</w:t>
+      </w:r>
+    </w:p>
+    <w:p>
+      <w:pPr>
+        <w:pStyle w:val="Heading21"/>
+      </w:pPr>
+      <w:r>
+        <w:t>Class plan before October fabrication</w:t>
+      </w:r>
+    </w:p>
+    <w:p>
+      <w:r>
+        <w:t>Meetings run from 11:30 a.m. to 12:45 p.m. The remaining part of Lecture 1 is completed on September 29. Its fuselage and monocoque extensions become reading rather than delaying the wing calculation and print-release work.</w:t>
+      </w:r>
+    </w:p>
+    <w:tbl>
+      <w:tblPr>
+        <w:tblW w:type="auto" w:w="0"/>
+        <w:jc w:val="center"/>
+        <w:tblLayout w:type="fixed"/>
+        <w:tblLook w:firstColumn="1" w:firstRow="1" w:lastColumn="0" w:lastRow="0" w:noHBand="0" w:noVBand="1" w:val="04A0"/>
+        <w:tblBorders>
+          <w:top w:val="single" w:sz="4" w:color="D9D9D9"/>
+          <w:left w:val="single" w:sz="4" w:color="D9D9D9"/>
+          <w:bottom w:val="single" w:sz="4" w:color="D9D9D9"/>
+          <w:right w:val="single" w:sz="4" w:color="D9D9D9"/>
+          <w:insideH w:val="single" w:sz="4" w:color="D9D9D9"/>
+          <w:insideV w:val="single" w:sz="4" w:color="D9D9D9"/>
+        </w:tblBorders>
+      </w:tblPr>
+      <w:tblGrid>
+        <w:gridCol w:w="3427"/>
+        <w:gridCol w:w="3427"/>
+        <w:gridCol w:w="3427"/>
+      </w:tblGrid>
+      <w:tr>
+        <w:trPr>
+          <w:tblHeader w:val="true"/>
+        </w:trPr>
+        <w:tc>
+          <w:tcPr>
+            <w:tcW w:type="dxa" w:w="1584"/>
+            <w:vAlign w:val="center"/>
+            <w:shd w:fill="274766"/>
+          </w:tcPr>
+          <w:p>
+            <w:pPr>
+              <w:spacing w:after="0" w:before="0"/>
+            </w:pPr>
+            <w:r>
+              <w:rPr>
+                <w:rFonts w:ascii="Times New Roman" w:hAnsi="Times New Roman"/>
+                <w:b/>
+                <w:color w:val="FFFFFF"/>
+                <w:sz w:val="18"/>
+              </w:rPr>
+              <w:t>Meeting</w:t>
+            </w:r>
+          </w:p>
+        </w:tc>
+        <w:tc>
+          <w:tcPr>
+            <w:tcW w:type="dxa" w:w="6552"/>
+            <w:vAlign w:val="center"/>
+            <w:shd w:fill="274766"/>
+          </w:tcPr>
+          <w:p>
+            <w:pPr>
+              <w:spacing w:after="0" w:before="0"/>
+            </w:pPr>
+            <w:r>
+              <w:rPr>
+                <w:rFonts w:ascii="Times New Roman" w:hAnsi="Times New Roman"/>
+                <w:b/>
+                <w:color w:val="FFFFFF"/>
+                <w:sz w:val="18"/>
+              </w:rPr>
+              <w:t>In-class sequence and time</w:t>
+            </w:r>
+          </w:p>
+        </w:tc>
+        <w:tc>
+          <w:tcPr>
+            <w:tcW w:type="dxa" w:w="2088"/>
+            <w:vAlign w:val="center"/>
+            <w:shd w:fill="274766"/>
+          </w:tcPr>
+          <w:p>
+            <w:pPr>
+              <w:spacing w:after="0" w:before="0"/>
+            </w:pPr>
+            <w:r>
+              <w:rPr>
+                <w:rFonts w:ascii="Times New Roman" w:hAnsi="Times New Roman"/>
+                <w:b/>
+                <w:color w:val="FFFFFF"/>
+                <w:sz w:val="18"/>
+              </w:rPr>
+              <w:t>Evidence at end of meeting</w:t>
+            </w:r>
+          </w:p>
+        </w:tc>
+      </w:tr>
+      <w:tr>
+        <w:tc>
+          <w:tcPr>
+            <w:tcW w:type="dxa" w:w="1584"/>
+            <w:vAlign w:val="center"/>
+          </w:tcPr>
+          <w:p>
+            <w:pPr>
+              <w:spacing w:after="0" w:before="0"/>
+            </w:pPr>
+            <w:r>
+              <w:rPr>
+                <w:rFonts w:ascii="Times New Roman" w:hAnsi="Times New Roman"/>
+                <w:color w:val="000000"/>
+                <w:sz w:val="18"/>
+              </w:rPr>
+              <w:t>Tue. Sept. 29</w:t>
+            </w:r>
+          </w:p>
+        </w:tc>
+        <w:tc>
+          <w:tcPr>
+            <w:tcW w:type="dxa" w:w="6552"/>
+            <w:vAlign w:val="center"/>
+          </w:tcPr>
+          <w:p>
+            <w:pPr>
+              <w:spacing w:after="0" w:before="0"/>
+            </w:pPr>
+            <w:r>
+              <w:rPr>
+                <w:rFonts w:ascii="Times New Roman" w:hAnsi="Times New Roman"/>
+                <w:color w:val="000000"/>
+                <w:sz w:val="18"/>
+              </w:rPr>
+              <w:t>11:30-11:40 retrieve tail-to-wing vocabulary; 11:40-12:05 finish Lecture 1 wing parts and devices (7A-7A-4), including a brief spoileron/wing-tip-rudder distinction; 12:05-12:25 trace skin-rib-rod/root load paths and the 7C wing cut; 12:25-12:40 map those parts to the team semi-wing; 12:40-12:45 exit check.</w:t>
+            </w:r>
+          </w:p>
+        </w:tc>
+        <w:tc>
+          <w:tcPr>
+            <w:tcW w:type="dxa" w:w="2088"/>
+            <w:vAlign w:val="center"/>
+          </w:tcPr>
+          <w:p>
+            <w:pPr>
+              <w:spacing w:after="0" w:before="0"/>
+            </w:pPr>
+            <w:r>
+              <w:rPr>
+                <w:rFonts w:ascii="Times New Roman" w:hAnsi="Times New Roman"/>
+                <w:color w:val="000000"/>
+                <w:sz w:val="18"/>
+              </w:rPr>
+              <w:t>Labeled half-wing, root-to-tip load path, and one unanswered design question.</w:t>
+            </w:r>
+          </w:p>
+        </w:tc>
+      </w:tr>
+      <w:tr>
+        <w:tc>
+          <w:tcPr>
+            <w:tcW w:type="dxa" w:w="1584"/>
+            <w:vAlign w:val="center"/>
+            <w:shd w:fill="F2F6FA"/>
+          </w:tcPr>
+          <w:p>
+            <w:pPr>
+              <w:spacing w:after="0" w:before="0"/>
+            </w:pPr>
+            <w:r>
+              <w:rPr>
+                <w:rFonts w:ascii="Times New Roman" w:hAnsi="Times New Roman"/>
+                <w:color w:val="000000"/>
+                <w:sz w:val="18"/>
+              </w:rPr>
+              <w:t>Thu. Oct. 1</w:t>
+            </w:r>
+          </w:p>
+        </w:tc>
+        <w:tc>
+          <w:tcPr>
+            <w:tcW w:type="dxa" w:w="6552"/>
+            <w:vAlign w:val="center"/>
+            <w:shd w:fill="F2F6FA"/>
+          </w:tcPr>
+          <w:p>
+            <w:pPr>
+              <w:spacing w:after="0" w:before="0"/>
+            </w:pPr>
+            <w:r>
+              <w:rPr>
+                <w:rFonts w:ascii="Times New Roman" w:hAnsi="Times New Roman"/>
+                <w:color w:val="000000"/>
+                <w:sz w:val="18"/>
+              </w:rPr>
+              <w:t>11:30-11:40 retrieval and units; 11:40-12:05 semi-span, chord law, taper, projected semi-wing area, mirrored full-wing area and aspect ratio; 12:05-12:25 hand calculation for the 450/160/100 mm baseline; 12:25-12:40 independent peer check against the guided notebook; 12:40-12:45 exit check.</w:t>
+            </w:r>
+          </w:p>
+        </w:tc>
+        <w:tc>
+          <w:tcPr>
+            <w:tcW w:type="dxa" w:w="2088"/>
+            <w:vAlign w:val="center"/>
+            <w:shd w:fill="F2F6FA"/>
+          </w:tcPr>
+          <w:p>
+            <w:pPr>
+              <w:spacing w:after="0" w:before="0"/>
+            </w:pPr>
+            <w:r>
+              <w:rPr>
+                <w:rFonts w:ascii="Times New Roman" w:hAnsi="Times New Roman"/>
+                <w:color w:val="000000"/>
+                <w:sz w:val="18"/>
+              </w:rPr>
+              <w:t>Signed geometry sheet with units and a separately checked result. HW 1 due.</w:t>
+            </w:r>
+          </w:p>
+        </w:tc>
+      </w:tr>
+      <w:tr>
+        <w:tc>
+          <w:tcPr>
+            <w:tcW w:type="dxa" w:w="1584"/>
+            <w:vAlign w:val="center"/>
+          </w:tcPr>
+          <w:p>
+            <w:pPr>
+              <w:spacing w:after="0" w:before="0"/>
+            </w:pPr>
+            <w:r>
+              <w:rPr>
+                <w:rFonts w:ascii="Times New Roman" w:hAnsi="Times New Roman"/>
+                <w:color w:val="000000"/>
+                <w:sz w:val="18"/>
+              </w:rPr>
+              <w:t>Tue. Oct. 6</w:t>
+            </w:r>
+          </w:p>
+        </w:tc>
+        <w:tc>
+          <w:tcPr>
+            <w:tcW w:type="dxa" w:w="6552"/>
+            <w:vAlign w:val="center"/>
+          </w:tcPr>
+          <w:p>
+            <w:pPr>
+              <w:spacing w:after="0" w:before="0"/>
+            </w:pPr>
+            <w:r>
+              <w:rPr>
+                <w:rFonts w:ascii="Times New Roman" w:hAnsi="Times New Roman"/>
+                <w:color w:val="000000"/>
+                <w:sz w:val="18"/>
+              </w:rPr>
+              <w:t>11:30-11:40 decode an approved NACA four-digit section; 11:40-12:00 place the fixed rods, ribs and module cuts and check build-envelope and wall limits; 12:00-12:20 distinguish radial from diametral clearance and predict coupon-hole sizes; 12:20-12:40 run Coupon Only and plan the supervised physical fit test; 12:40-12:45 exit check.</w:t>
+            </w:r>
+          </w:p>
+        </w:tc>
+        <w:tc>
+          <w:tcPr>
+            <w:tcW w:type="dxa" w:w="2088"/>
+            <w:vAlign w:val="center"/>
+          </w:tcPr>
+          <w:p>
+            <w:pPr>
+              <w:spacing w:after="0" w:before="0"/>
+            </w:pPr>
+            <w:r>
+              <w:rPr>
+                <w:rFonts w:ascii="Times New Roman" w:hAnsi="Times New Roman"/>
+                <w:color w:val="000000"/>
+                <w:sz w:val="18"/>
+              </w:rPr>
+              <w:t>Coupon R01 archive and booked staff-supervised coupon test; measured fit record follows the physical print.</w:t>
+            </w:r>
+          </w:p>
+        </w:tc>
+      </w:tr>
+      <w:tr>
+        <w:tc>
+          <w:tcPr>
+            <w:tcW w:type="dxa" w:w="1584"/>
+            <w:vAlign w:val="center"/>
+            <w:shd w:fill="F2F6FA"/>
+          </w:tcPr>
+          <w:p>
+            <w:pPr>
+              <w:spacing w:after="0" w:before="0"/>
+            </w:pPr>
+            <w:r>
+              <w:rPr>
+                <w:rFonts w:ascii="Times New Roman" w:hAnsi="Times New Roman"/>
+                <w:color w:val="000000"/>
+                <w:sz w:val="18"/>
+              </w:rPr>
+              <w:t>Thu. Oct. 8</w:t>
+            </w:r>
+          </w:p>
+        </w:tc>
+        <w:tc>
+          <w:tcPr>
+            <w:tcW w:type="dxa" w:w="6552"/>
+            <w:vAlign w:val="center"/>
+            <w:shd w:fill="F2F6FA"/>
+          </w:tcPr>
+          <w:p>
+            <w:pPr>
+              <w:spacing w:after="0" w:before="0"/>
+            </w:pPr>
+            <w:r>
+              <w:rPr>
+                <w:rFonts w:ascii="Times New Roman" w:hAnsi="Times New Roman"/>
+                <w:color w:val="000000"/>
+                <w:sz w:val="18"/>
+              </w:rPr>
+              <w:t>11:30-11:45 draw the cantilever free-body diagram for one instructor-specified virtual load (no load is applied to the student wing); 11:45-12:05 check shear/root moment, module dimensions and CAD/slicer mass; 12:05-12:35 peer review coupon evidence, R02 clean run, every-layer preview and revision trace; 12:35-12:45 staff release or written correction list.</w:t>
+            </w:r>
+          </w:p>
+        </w:tc>
+        <w:tc>
+          <w:tcPr>
+            <w:tcW w:type="dxa" w:w="2088"/>
+            <w:vAlign w:val="center"/>
+            <w:shd w:fill="F2F6FA"/>
+          </w:tcPr>
+          <w:p>
+            <w:pPr>
+              <w:spacing w:after="0" w:before="0"/>
+            </w:pPr>
+            <w:r>
+              <w:rPr>
+                <w:rFonts w:ascii="Times New Roman" w:hAnsi="Times New Roman"/>
+                <w:color w:val="000000"/>
+                <w:sz w:val="18"/>
+              </w:rPr>
+              <w:t>Pre-print release packet or explicit hold. No final-wing print without a physical coupon and staff authorization.</w:t>
+            </w:r>
+          </w:p>
+        </w:tc>
+      </w:tr>
+    </w:tbl>
+    <w:p>
+      <w:pPr>
+        <w:spacing w:before="120" w:after="120"/>
+      </w:pPr>
+      <w:r>
+        <w:t>Required before the first wing module: semi-wing and full-wing geometry with units; rod and module locations; a one-half-wing free-body diagram and independently checked shear/root-moment demand for the assigned virtual load; measured rod diameter and physical coupon fit; a clean final-wing R02 run; CAD mass at or below 300 g; checked module bounds and every slicer layer; safety authorization and a team-specific printer reservation. A missing coupon or failed check keeps the team in the coupon/prototype workflow.</w:t>
       </w:r>
     </w:p>
     <w:tbl>
@@ -6825,7 +7263,7 @@
               <w:rPr>
                 <w:sz w:val="15"/>
               </w:rPr>
-              <w:t>Finite-wing geometry: span, chord, aspect ratio, taper, sweep, dihedral; lift distribution; skin–rib–spar load paths; cantilever idealization</w:t>
+              <w:t>Finite-wing geometry, skin-rib-spar load paths, and cantilever idealization; existing three-person teams prepare for the project launch.</w:t>
             </w:r>
           </w:p>
         </w:tc>
@@ -6850,7 +7288,7 @@
               <w:rPr>
                 <w:sz w:val="15"/>
               </w:rPr>
-              <w:t>Team survey Sept. 17</w:t>
+              <w:t>Teams already assigned; no new team-formation task.</w:t>
             </w:r>
           </w:p>
         </w:tc>
@@ -6913,7 +7351,7 @@
               <w:rPr>
                 <w:sz w:val="15"/>
               </w:rPr>
-              <w:t>External/internal loads; equilibrium; normal/shear stress and strain; wing free-body diagrams</w:t>
+              <w:t>External and internal loads, equilibrium, stress and strain, and wing free-body diagrams.</w:t>
             </w:r>
           </w:p>
         </w:tc>
@@ -6938,7 +7376,7 @@
               <w:rPr>
                 <w:sz w:val="15"/>
               </w:rPr>
-              <w:t>Teams posted Sept. 22; Fri. Sept. 25 optional Manela seminar</w:t>
+              <w:t>Existing teams active; Fri. Sept. 25 optional Manela seminar.</w:t>
             </w:r>
           </w:p>
         </w:tc>
@@ -7001,7 +7439,7 @@
               <w:rPr>
                 <w:sz w:val="15"/>
               </w:rPr>
-              <w:t>Stress transformation; Mohr's circle; principal stresses; aerospace failure questions; paired audit of a correct-looking worked/AI solution</w:t>
+              <w:t>Sept. 29: finish Lecture 1 wing anatomy, devices, spoileron comparison, and structural load paths. Oct. 1: semi-wing geometry, taper, area, aspect ratio, and independent hand check.</w:t>
             </w:r>
           </w:p>
         </w:tc>
@@ -7026,7 +7464,7 @@
               <w:rPr>
                 <w:sz w:val="15"/>
               </w:rPr>
-              <w:t>HW 1 due Oct. 1</w:t>
+              <w:t>HW 1 due Oct. 1; team calculation sheet started.</w:t>
             </w:r>
           </w:p>
         </w:tc>
@@ -7089,7 +7527,7 @@
               <w:rPr>
                 <w:sz w:val="15"/>
               </w:rPr>
-              <w:t>Three-dimensional stress tensor; principal values/directions; constitutive law; plane stress/plane strain</w:t>
+              <w:t>Oct. 6: NACA section, rods, modules, printer constraints, and physical fit coupon. Oct. 8: cantilever free-body diagram, virtual-load shear and root moment, peer audit, and print-release review.</w:t>
             </w:r>
           </w:p>
         </w:tc>
@@ -7114,7 +7552,7 @@
               <w:rPr>
                 <w:sz w:val="15"/>
               </w:rPr>
-              <w:t>HW 2 work session</w:t>
+              <w:t>Coupon R01 and fit record by Oct. 8; pre-print package reviewed Oct. 8-9.</w:t>
             </w:r>
           </w:p>
         </w:tc>
@@ -7177,7 +7615,7 @@
               <w:rPr>
                 <w:sz w:val="15"/>
               </w:rPr>
-              <w:t>Beam shear/moment, bending stress, slope/deflection; project load case and requirements</w:t>
+              <w:t>Oct. 13: supervised wing-module fabrication launch in assigned slots, with a beam-equilibrium studio for teams waiting their turn. Oct. 15: beam shear/moment, bending stress, slope and deflection; inspect first-print evidence.</w:t>
             </w:r>
           </w:p>
         </w:tc>
@@ -7202,7 +7640,7 @@
               <w:rPr>
                 <w:sz w:val="15"/>
               </w:rPr>
-              <w:t>HW 2 due Oct. 13; concept memo Oct. 15</w:t>
+              <w:t>Wing construction starts Oct. 13 only for released teams.</w:t>
             </w:r>
           </w:p>
         </w:tc>
@@ -7265,7 +7703,7 @@
               <w:rPr>
                 <w:sz w:val="15"/>
               </w:rPr>
-              <w:t>Strain energy, virtual work, Castigliano; determinate/indeterminate structures; model-validity and solution-audit review</w:t>
+              <w:t>Two- and three-dimensional stress transformation; Mohr's circle, principal stresses and directions; constitutive and plane-stress assumptions. Audit one plausible but flawed solution.</w:t>
             </w:r>
           </w:p>
         </w:tc>
@@ -7290,7 +7728,7 @@
               <w:rPr>
                 <w:sz w:val="15"/>
               </w:rPr>
-              <w:t>HW 3 due Oct. 22; code checkpoint</w:t>
+              <w:t>As-built and reproducibility checkpoint Oct. 22.</w:t>
             </w:r>
           </w:p>
         </w:tc>
@@ -7353,7 +7791,7 @@
               <w:rPr>
                 <w:sz w:val="15"/>
               </w:rPr>
-              <w:t>Midterm; guest class on electric propulsion, industry practice, and internship/career pathways</w:t>
+              <w:t>Midterm Oct. 27; guest class Oct. 29 on electric propulsion, industry practice, and internship/career pathways.</w:t>
             </w:r>
           </w:p>
         </w:tc>
@@ -7378,7 +7816,7 @@
               <w:rPr>
                 <w:sz w:val="15"/>
               </w:rPr>
-              <w:t>Midterm Oct. 27; Dr. Tsay Oct. 29</w:t>
+              <w:t>Midterm Oct. 27; Dr. Tsay Oct. 29.</w:t>
             </w:r>
           </w:p>
         </w:tc>
@@ -7441,7 +7879,7 @@
               <w:rPr>
                 <w:sz w:val="15"/>
               </w:rPr>
-              <w:t>Nov. 3: no class (University schedule); aircraft maneuver/landing loads and V–n diagrams</w:t>
+              <w:t>Nov. 3: no class (University schedule). Nov. 5: strain energy, virtual work, and a beam-model validity check.</w:t>
             </w:r>
           </w:p>
         </w:tc>
@@ -7466,7 +7904,7 @@
               <w:rPr>
                 <w:sz w:val="15"/>
               </w:rPr>
-              <w:t>HW 4 preparation</w:t>
+              <w:t>HW 2 due Nov. 5.</w:t>
             </w:r>
           </w:p>
         </w:tc>
@@ -7529,7 +7967,7 @@
               <w:rPr>
                 <w:sz w:val="15"/>
               </w:rPr>
-              <w:t>Wing structural idealization; booms/stringers/skins; DfAM; printer orientation and coupon checks</w:t>
+              <w:t>Nov. 10: Castigliano and determinate/indeterminate structures. Nov. 12: maneuver and landing loads, V-n diagrams, wing structural idealization, and assembly review.</w:t>
             </w:r>
           </w:p>
         </w:tc>
@@ -7554,7 +7992,7 @@
               <w:rPr>
                 <w:sz w:val="15"/>
               </w:rPr>
-              <w:t>HW 4 due Nov. 12; design review</w:t>
+              <w:t>HW 3 due Nov. 12; design and assembly review.</w:t>
             </w:r>
           </w:p>
         </w:tc>
@@ -7617,7 +8055,7 @@
               <w:rPr>
                 <w:sz w:val="15"/>
               </w:rPr>
-              <w:t>Thin-walled open/closed sections; shear flow, torsion, shear center; print-readiness studio</w:t>
+              <w:t>Thin-walled wing-box idealization, shear flow, torsion and shear center; compare the structural model with printed geometry and inspection evidence.</w:t>
             </w:r>
           </w:p>
         </w:tc>
@@ -7642,7 +8080,7 @@
               <w:rPr>
                 <w:sz w:val="15"/>
               </w:rPr>
-              <w:t>HW 5 due Nov. 19; print gate</w:t>
+              <w:t>HW 4 due Nov. 19; Nov. 16 supervised assembly/inspection slot.</w:t>
             </w:r>
           </w:p>
         </w:tc>
@@ -7705,7 +8143,7 @@
               <w:rPr>
                 <w:sz w:val="15"/>
               </w:rPr>
-              <w:t>No regular MIE 446 meetings: Nov. 24 follows a Wednesday schedule; Thanksgiving recess</w:t>
+              <w:t>No regular MIE 446 meetings: Nov. 24 follows a Wednesday schedule; Thanksgiving recess.</w:t>
             </w:r>
           </w:p>
         </w:tc>
@@ -7730,7 +8168,7 @@
               <w:rPr>
                 <w:sz w:val="15"/>
               </w:rPr>
-              <w:t>Approved print slots only if shared schedule permits</w:t>
+              <w:t>Approved inspection or correction slots only if the shared schedule permits.</w:t>
             </w:r>
           </w:p>
         </w:tc>
@@ -7793,7 +8231,7 @@
               <w:rPr>
                 <w:sz w:val="15"/>
               </w:rPr>
-              <w:t>Fabrication, assembly, manual and Jetson machine-vision inspection, calibration and uncertainty; shared force-deflection, vibration, and crack demonstration; hand-code/AI-build reconciliation</w:t>
+              <w:t>Manual and calibrated Jetson machine-vision inspection, uncertainty, build acceptance, and shared force-deflection, vibration, and crack demonstration.</w:t>
             </w:r>
           </w:p>
         </w:tc>
@@ -7818,7 +8256,7 @@
               <w:rPr>
                 <w:sz w:val="15"/>
               </w:rPr>
-              <w:t>HW 6 due Dec. 3; inspection evidence and shared diagnostic analysis</w:t>
+              <w:t>HW 5 due Dec. 3; inspection and diagnostic evidence.</w:t>
             </w:r>
           </w:p>
         </w:tc>
@@ -7881,7 +8319,7 @@
               <w:rPr>
                 <w:sz w:val="15"/>
               </w:rPr>
-              <w:t>Build acceptance, diagnostic evidence synthesis, and team presentations</w:t>
+              <w:t>Build acceptance, diagnostic synthesis, team presentations, and individual technical questions.</w:t>
             </w:r>
           </w:p>
         </w:tc>
@@ -7906,7 +8344,7 @@
               <w:rPr>
                 <w:sz w:val="15"/>
               </w:rPr>
-              <w:t>Presentation groups A–N</w:t>
+              <w:t>HW 6 due Dec. 10; presentation groups assigned in Canvas.</w:t>
             </w:r>
           </w:p>
         </w:tc>
@@ -8000,12 +8438,6 @@
         </w:tc>
       </w:tr>
     </w:tbl>
-    <w:p>
-      <w:pPr>
-        <w:spacing w:after="0"/>
-        <w:jc w:val="both"/>
-      </w:pPr>
-    </w:p>
     <w:p>
       <w:pPr>
         <w:pStyle w:val="Heading21"/>
@@ -8279,7 +8711,7 @@
               <w:rPr>
                 <w:sz w:val="16"/>
               </w:rPr>
-              <w:t>Oct. 13</w:t>
+              <w:t>Nov. 5</w:t>
             </w:r>
           </w:p>
         </w:tc>
@@ -8360,7 +8792,7 @@
               <w:rPr>
                 <w:sz w:val="16"/>
               </w:rPr>
-              <w:t>Oct. 22</w:t>
+              <w:t>Nov. 12</w:t>
             </w:r>
           </w:p>
         </w:tc>
@@ -8441,7 +8873,7 @@
               <w:rPr>
                 <w:sz w:val="16"/>
               </w:rPr>
-              <w:t>Nov. 12</w:t>
+              <w:t>Nov. 19</w:t>
             </w:r>
           </w:p>
         </w:tc>
@@ -8522,7 +8954,7 @@
               <w:rPr>
                 <w:sz w:val="16"/>
               </w:rPr>
-              <w:t>Nov. 19</w:t>
+              <w:t>Dec. 3</w:t>
             </w:r>
           </w:p>
         </w:tc>
@@ -8603,7 +9035,7 @@
               <w:rPr>
                 <w:sz w:val="16"/>
               </w:rPr>
-              <w:t>Dec. 3</w:t>
+              <w:t>Dec. 10</w:t>
             </w:r>
           </w:p>
         </w:tc>
@@ -10721,6 +11153,16 @@
       <w:sz w:val="18"/>
     </w:rPr>
   </w:style>
+  <w:style w:type="paragraph" w:customStyle="1" w:styleId="Title">
+    <w:name w:val="Title"/>
+    <w:basedOn w:val="Normal"/>
+    <w:rPr>
+      <w:rFonts w:ascii="Times New Roman" w:hAnsi="Times New Roman"/>
+      <w:b/>
+      <w:color w:val="000000"/>
+      <w:sz w:val="38"/>
+    </w:rPr>
+  </w:style>
 </w:styles>
 </file>
 

</xml_diff>

<commit_message>
Synchronize Word syllabus Homework 2 deadline with October 18
</commit_message>
<xml_diff>
--- a/docs/MIE_446_Aerospace_Structures_Fall_2026_Syllabus_Updated.docx
+++ b/docs/MIE_446_Aerospace_Structures_Fall_2026_Syllabus_Updated.docx
@@ -7640,7 +7640,7 @@
               <w:rPr>
                 <w:sz w:val="15"/>
               </w:rPr>
-              <w:t>Wing construction starts Oct. 13 only for released teams.</w:t>
+              <w:t>Wing construction starts Oct. 13 only for released teams; HW 2 due Sunday, Oct. 18, 2026.</w:t>
             </w:r>
           </w:p>
         </w:tc>
@@ -7904,7 +7904,7 @@
               <w:rPr>
                 <w:sz w:val="15"/>
               </w:rPr>
-              <w:t>HW 2 due Nov. 5.</w:t>
+              <w:t>No HW 2 deadline this week; due Oct. 18.</w:t>
             </w:r>
           </w:p>
         </w:tc>
@@ -8711,7 +8711,7 @@
               <w:rPr>
                 <w:sz w:val="16"/>
               </w:rPr>
-              <w:t>Nov. 5</w:t>
+              <w:t>Oct. 18, 2026</w:t>
             </w:r>
           </w:p>
         </w:tc>

</xml_diff>

<commit_message>
Update Word syllabus for HW2 split and add Lecture 03 beam verification HW3B
</commit_message>
<xml_diff>
--- a/docs/MIE_446_Aerospace_Structures_Fall_2026_Syllabus_Updated.docx
+++ b/docs/MIE_446_Aerospace_Structures_Fall_2026_Syllabus_Updated.docx
@@ -7640,7 +7640,7 @@
               <w:rPr>
                 <w:sz w:val="15"/>
               </w:rPr>
-              <w:t>Wing construction starts Oct. 13 only for released teams; HW 2 due Sunday, Oct. 18, 2026.</w:t>
+              <w:t>Wing construction starts Oct. 13 only for released teams; HW 2A (Parts 1 and 3, 35 points) due Oct. 20.</w:t>
             </w:r>
           </w:p>
         </w:tc>
@@ -7904,7 +7904,7 @@
               <w:rPr>
                 <w:sz w:val="15"/>
               </w:rPr>
-              <w:t>No HW 2 deadline this week; due Oct. 18.</w:t>
+              <w:t>HW 2B (Parts 2, 4 and 5, 65 points) due Nov. 5.</w:t>
             </w:r>
           </w:p>
         </w:tc>
@@ -8686,7 +8686,7 @@
               <w:rPr>
                 <w:sz w:val="16"/>
               </w:rPr>
-              <w:t>Choose the model: 2D/3D stress transformation, principal stresses, constitutive assumptions and validity</w:t>
+              <w:t>HW 2A: Lilienthal evidence and side-force geometry (35 points). HW 2B: integration, elevon mixing and local load paths (65 points).</w:t>
             </w:r>
           </w:p>
         </w:tc>
@@ -8711,7 +8711,7 @@
               <w:rPr>
                 <w:sz w:val="16"/>
               </w:rPr>
-              <w:t>Oct. 18, 2026</w:t>
+              <w:t>HW 2A: Oct. 20; HW 2B: Nov. 5, 2026</w:t>
             </w:r>
           </w:p>
         </w:tc>

</xml_diff>

<commit_message>
Reduce HW2B to three distributed-load beam cases with analytical and software solutions
</commit_message>
<xml_diff>
--- a/docs/MIE_446_Aerospace_Structures_Fall_2026_Syllabus_Updated.docx
+++ b/docs/MIE_446_Aerospace_Structures_Fall_2026_Syllabus_Updated.docx
@@ -2767,7 +2767,7 @@
         <w:rPr>
           <w:sz w:val="18"/>
         </w:rPr>
-        <w:t>Each homework submission is individual and contains four connected artifacts organized around the engineering reasoning cycle:</w:t>
+        <w:t>Unless a handout specifies otherwise, each homework submission is individual and contains the following artifacts. HW 2B requires only one PDF with analytical solutions and software comparisons:</w:t>
       </w:r>
     </w:p>
     <w:p>
@@ -7904,7 +7904,7 @@
               <w:rPr>
                 <w:sz w:val="15"/>
               </w:rPr>
-              <w:t>HW 2B (Parts 2, 4 and 5, 65 points) due Nov. 5.</w:t>
+              <w:t>HW 2B (three beam cases, 65 points) due Nov. 5.</w:t>
             </w:r>
           </w:p>
         </w:tc>
@@ -8686,7 +8686,7 @@
               <w:rPr>
                 <w:sz w:val="16"/>
               </w:rPr>
-              <w:t>HW 2A: Lilienthal evidence and side-force geometry (35 points). HW 2B: member bending, compatibility, software verification and distributed wing loads (65 points).</w:t>
+              <w:t>HW 2A: Lilienthal evidence and side-force geometry (35 points). HW 2B: reactions and support displacement/rotation for three distributed-load beams, analytically and with software (65 points).</w:t>
             </w:r>
           </w:p>
         </w:tc>

</xml_diff>

<commit_message>
Release HW 3 and align Lecture 03 with general Beam Lab supports
</commit_message>
<xml_diff>
--- a/docs/MIE_446_Aerospace_Structures_Fall_2026_Syllabus_Updated.docx
+++ b/docs/MIE_446_Aerospace_Structures_Fall_2026_Syllabus_Updated.docx
@@ -395,49 +395,49 @@
               <w:rPr>
                 <w:sz w:val="18"/>
               </w:rPr>
-              <w:t xml:space="preserve">Gunness Laboratory, Room </w:t>
+              <w:t xml:space="preserve">Gunness Laboratory, Room 1 • Office hours: Fri. 12:20-1:10 PM (Other hours by appointment)</w:t>
             </w:r>
             <w:r>
               <w:rPr>
                 <w:sz w:val="18"/>
               </w:rPr>
-              <w:t>1</w:t>
+              <w:t/>
             </w:r>
             <w:r>
               <w:rPr>
                 <w:sz w:val="18"/>
               </w:rPr>
-              <w:t xml:space="preserve"> • </w:t>
+              <w:t xml:space="preserve"/>
             </w:r>
             <w:r>
               <w:rPr>
                 <w:sz w:val="18"/>
               </w:rPr>
-              <w:t xml:space="preserve">Office hours: </w:t>
+              <w:t xml:space="preserve"/>
             </w:r>
             <w:r>
               <w:rPr>
                 <w:rFonts w:asciiTheme="majorBidi" w:hAnsiTheme="majorBidi" w:cstheme="majorBidi"/>
               </w:rPr>
-              <w:t xml:space="preserve">Fri. 12:20-1:10 PM </w:t>
+              <w:t xml:space="preserve"/>
             </w:r>
             <w:r>
               <w:rPr>
                 <w:rFonts w:asciiTheme="majorBidi" w:hAnsiTheme="majorBidi" w:cstheme="majorBidi"/>
               </w:rPr>
-              <w:t xml:space="preserve">(Other hours </w:t>
+              <w:t xml:space="preserve"/>
             </w:r>
             <w:r>
               <w:rPr>
                 <w:rFonts w:asciiTheme="majorBidi" w:hAnsiTheme="majorBidi" w:cstheme="majorBidi"/>
               </w:rPr>
-              <w:t>by appointment</w:t>
+              <w:t/>
             </w:r>
             <w:r>
               <w:rPr>
                 <w:rFonts w:asciiTheme="majorBidi" w:hAnsiTheme="majorBidi" w:cstheme="majorBidi"/>
               </w:rPr>
-              <w:t>)</w:t>
+              <w:t/>
             </w:r>
           </w:p>
         </w:tc>
@@ -583,13 +583,13 @@
         <w:jc w:val="both"/>
       </w:pPr>
       <w:r>
-        <w:t xml:space="preserve">Aerospace structures are light because they must fly, yet they must safely carry bending, shear, torsion, landing, and maneuver loads. This course connects those loads to </w:t>
-      </w:r>
-      <w:r>
-        <w:t>mechanical</w:t>
-      </w:r>
-      <w:r>
-        <w:t xml:space="preserve"> models and to a buildable wing. The opening bridge introduces airfoils and finite wings for students who have not taken an aerospace course; the remainder develops the structural tools needed to analyze a wing and the design-for-manufacture skills needed to code, print, inspect, and communicate a physical build.</w:t>
+        <w:t xml:space="preserve">Aerospace structures are light because they must fly, yet they must safely carry bending, shear, torsion, landing, and maneuver loads. This course connects those loads to mechanical models and to a buildable wing. The opening bridge introduces airfoils and finite wings for students who have not taken an aerospace course; the remainder develops the structural tools needed to analyze a wing and the design-for-manufacture skills needed to code, print, inspect, and communicate a physical build.</w:t>
+      </w:r>
+      <w:r>
+        <w:t/>
+      </w:r>
+      <w:r>
+        <w:t xml:space="preserve"/>
       </w:r>
     </w:p>
     <w:p>
@@ -639,13 +639,13 @@
           <w:b/>
           <w:sz w:val="18"/>
         </w:rPr>
-        <w:t xml:space="preserve">Course commitment. </w:t>
+        <w:t xml:space="preserve">Course commitment. AI can generate equations, code, plots, and polished explanations, but a correct-looking answer is not enough. Students will learn to frame the physical problem, trace the load path, predict behavior, select and justify a model, audit human/computational/AI results, interpret evidence, and defend a safe decision. Analytical work builds the internal physical model needed to supervise tools. Students - not tools - own the judgment, teamwork, physical evidence, and consequences.</w:t>
       </w:r>
       <w:r>
         <w:rPr>
           <w:sz w:val="18"/>
         </w:rPr>
-        <w:t>AI can generate equations, code, plots, and polished explanations, but a correct-looking answer is not enough. Students will learn to frame the physical problem, trace the load path, predict behavior, select and justify a model, audit human/computational/AI results, interpret evidence, and defend a safe decision. Analytical work builds the internal physical model needed to supervise tools. Students - not tools - own the judgment, teamwork, physical evidence, and consequences.</w:t>
+        <w:t/>
       </w:r>
     </w:p>
     <w:p>
@@ -1295,13 +1295,13 @@
           <w:b/>
           <w:sz w:val="17"/>
         </w:rPr>
-        <w:t xml:space="preserve">Teamwork: </w:t>
+        <w:t xml:space="preserve">Teamwork: Three-person teams rotate roles, review work, resolve interfaces, and share accountability.</w:t>
       </w:r>
       <w:r>
         <w:rPr>
           <w:sz w:val="17"/>
         </w:rPr>
-        <w:t>Three-person teams rotate roles, review work, resolve interfaces, and share accountability.</w:t>
+        <w:t/>
       </w:r>
     </w:p>
     <w:p>
@@ -1331,13 +1331,13 @@
           <w:b/>
           <w:sz w:val="17"/>
         </w:rPr>
-        <w:t xml:space="preserve">Creativity: </w:t>
+        <w:t xml:space="preserve">Creativity: Teams generate and compare design alternatives within real load, mass, material, and printer constraints.</w:t>
       </w:r>
       <w:r>
         <w:rPr>
           <w:sz w:val="17"/>
         </w:rPr>
-        <w:t>Teams generate and compare design alternatives within real load, mass, material, and printer constraints.</w:t>
+        <w:t/>
       </w:r>
     </w:p>
     <w:p>
@@ -1352,13 +1352,13 @@
           <w:b/>
           <w:sz w:val="17"/>
         </w:rPr>
-        <w:t xml:space="preserve">Empathy: </w:t>
+        <w:t xml:space="preserve">Empathy: Students listen, share work fairly, account for access and safety needs, and recognize how engineering choices affect people.</w:t>
       </w:r>
       <w:r>
         <w:rPr>
           <w:sz w:val="17"/>
         </w:rPr>
-        <w:t>Students listen, share work fairly, account for access and safety needs, and recognize how engineering choices affect people.</w:t>
+        <w:t/>
       </w:r>
     </w:p>
     <w:p>
@@ -1373,13 +1373,13 @@
           <w:b/>
           <w:sz w:val="17"/>
         </w:rPr>
-        <w:t xml:space="preserve">Human communication: </w:t>
+        <w:t xml:space="preserve">Human communication: Briefs, oral checks, peer critique, guest interaction, and the final defense require clear, respectful dialogue.</w:t>
       </w:r>
       <w:r>
         <w:rPr>
           <w:sz w:val="17"/>
         </w:rPr>
-        <w:t>Briefs, oral checks, peer critique, guest interaction, and the final defense require clear, respectful dialogue.</w:t>
+        <w:t/>
       </w:r>
     </w:p>
     <w:p>
@@ -1409,13 +1409,13 @@
           <w:b/>
           <w:sz w:val="17"/>
         </w:rPr>
-        <w:t xml:space="preserve">Lifelong learning: </w:t>
+        <w:t xml:space="preserve">Lifelong learning: Students document debugging, seek feedback, revise after failure, and identify what they need to learn next.</w:t>
       </w:r>
       <w:r>
         <w:rPr>
           <w:sz w:val="17"/>
         </w:rPr>
-        <w:t>Students document debugging, seek feedback, revise after failure, and identify what they need to learn next.</w:t>
+        <w:t/>
       </w:r>
     </w:p>
     <w:p>
@@ -1662,31 +1662,31 @@
               <w:rPr>
                 <w:sz w:val="15"/>
               </w:rPr>
-              <w:t xml:space="preserve">Gunness </w:t>
+              <w:t xml:space="preserve">Gunness 1; Fri. 12:20-1:10 PM </w:t>
             </w:r>
             <w:r>
               <w:rPr>
                 <w:sz w:val="15"/>
               </w:rPr>
-              <w:t>1</w:t>
+              <w:t/>
             </w:r>
             <w:r>
               <w:rPr>
                 <w:sz w:val="15"/>
               </w:rPr>
-              <w:t xml:space="preserve">; </w:t>
+              <w:t xml:space="preserve"/>
             </w:r>
             <w:r>
               <w:rPr>
                 <w:sz w:val="15"/>
               </w:rPr>
-              <w:t>Fri. 12:20-1:10 PM</w:t>
+              <w:t/>
             </w:r>
             <w:r>
               <w:rPr>
                 <w:rFonts w:asciiTheme="majorBidi" w:hAnsiTheme="majorBidi" w:cstheme="majorBidi"/>
               </w:rPr>
-              <w:t xml:space="preserve"> </w:t>
+              <w:t xml:space="preserve"/>
             </w:r>
           </w:p>
         </w:tc>
@@ -2064,14 +2064,14 @@
               <w:rPr>
                 <w:sz w:val="16"/>
               </w:rPr>
-              <w:t>Fri., Sept. 25</w:t>
+              <w:t>Fri., Sept. 25(outside class)</w:t>
             </w:r>
             <w:r>
               <w:rPr>
                 <w:sz w:val="16"/>
               </w:rPr>
               <w:br/>
-              <w:t>(outside class)</w:t>
+              <w:t/>
             </w:r>
           </w:p>
         </w:tc>
@@ -2096,19 +2096,19 @@
               <w:rPr>
                 <w:sz w:val="16"/>
               </w:rPr>
-              <w:t>Dr. Avshalom Manela, Technion</w:t>
+              <w:t>Dr. Avshalom Manela, Technion, Associate Professor and Vice Dean for Teaching; research in rarefied-gas dynamics, small-scale flows, heat/mass transfer, aeroacoustics, and fluid–structure interaction.</w:t>
             </w:r>
             <w:r>
               <w:rPr>
                 <w:sz w:val="16"/>
               </w:rPr>
-              <w:t xml:space="preserve">, </w:t>
+              <w:t xml:space="preserve"/>
             </w:r>
             <w:r>
               <w:rPr>
                 <w:sz w:val="16"/>
               </w:rPr>
-              <w:t>Associate Professor and Vice Dean for Teaching; research in rarefied-gas dynamics, small-scale flows, heat/mass transfer, aeroacoustics, and fluid–structure interaction.</w:t>
+              <w:t/>
             </w:r>
           </w:p>
         </w:tc>
@@ -2133,19 +2133,19 @@
               <w:rPr>
                 <w:sz w:val="16"/>
               </w:rPr>
-              <w:t>Optional research seminar</w:t>
+              <w:t>Optional research seminar: final time, title, and room will be announced in Canvas. Pizza lunch afterward. Attendance/reflection may earn the published extra credit.</w:t>
             </w:r>
             <w:r>
               <w:rPr>
                 <w:sz w:val="16"/>
               </w:rPr>
-              <w:t>:</w:t>
+              <w:t/>
             </w:r>
             <w:r>
               <w:rPr>
                 <w:sz w:val="16"/>
               </w:rPr>
-              <w:t xml:space="preserve"> final time, title, and room will be announced in Canvas. Pizza lunch afterward. Attendance/reflection may earn the published extra credit.</w:t>
+              <w:t xml:space="preserve"/>
             </w:r>
           </w:p>
         </w:tc>
@@ -2176,21 +2176,21 @@
               <w:rPr>
                 <w:sz w:val="16"/>
               </w:rPr>
-              <w:t>Thu., Oct. 29</w:t>
+              <w:t>Thu., Oct. 2911:30–12:45ELAB 323</w:t>
             </w:r>
             <w:r>
               <w:rPr>
                 <w:sz w:val="16"/>
               </w:rPr>
               <w:br/>
-              <w:t>11:30–12:45</w:t>
+              <w:t/>
             </w:r>
             <w:r>
               <w:rPr>
                 <w:sz w:val="16"/>
               </w:rPr>
               <w:br/>
-              <w:t>ELAB 323</w:t>
+              <w:t/>
             </w:r>
           </w:p>
         </w:tc>
@@ -2260,21 +2260,21 @@
         <w:rPr>
           <w:sz w:val="17"/>
         </w:rPr>
-        <w:t xml:space="preserve">Speaker background: </w:t>
+        <w:t xml:space="preserve">Speaker background: Dr. Manela's Technion profile. Dr. Tsay will also discuss industry practice and pathways to internships and careers at Busek.</w:t>
       </w:r>
       <w:hyperlink r:id="rId7">
         <w:r>
           <w:rPr>
             <w:u w:val="single"/>
           </w:rPr>
-          <w:t>Dr. Manela's Technion profile</w:t>
+          <w:t/>
         </w:r>
       </w:hyperlink>
       <w:r>
         <w:rPr>
           <w:sz w:val="17"/>
         </w:rPr>
-        <w:t>. Dr. Tsay will also discuss industry practice and pathways to internships and careers at Busek.</w:t>
+        <w:t/>
       </w:r>
     </w:p>
     <w:p>
@@ -2296,31 +2296,31 @@
         <w:rPr>
           <w:sz w:val="18"/>
         </w:rPr>
-        <w:t xml:space="preserve">The Sept. 25 event is outside class and optional. Attendance plus a 150-word technical reflection submitted within 48 hours earns up to </w:t>
+        <w:t xml:space="preserve">The Sept. 25 event is outside class and optional. Attendance plus a 150-word technical reflection submitted within 48 hours earns up to 2.5 course percentage point. Students unable to attend may complete the same reflection using another aerospace/industry seminar; this equal-access alternative earns identical credit.</w:t>
       </w:r>
       <w:r>
         <w:rPr>
           <w:sz w:val="18"/>
         </w:rPr>
-        <w:t>2</w:t>
+        <w:t/>
       </w:r>
       <w:r>
         <w:rPr>
           <w:sz w:val="18"/>
         </w:rPr>
-        <w:t>.</w:t>
+        <w:t/>
       </w:r>
       <w:r>
         <w:rPr>
           <w:sz w:val="18"/>
         </w:rPr>
-        <w:t>5</w:t>
+        <w:t/>
       </w:r>
       <w:r>
         <w:rPr>
           <w:sz w:val="18"/>
         </w:rPr>
-        <w:t xml:space="preserve"> course percentage point. Students unable to attend may complete the same reflection using another aerospace/industry seminar; this equal-access alternative earns identical credit.</w:t>
+        <w:t xml:space="preserve"/>
       </w:r>
     </w:p>
     <w:p>
@@ -2468,38 +2468,38 @@
               <w:rPr>
                 <w:sz w:val="17"/>
               </w:rPr>
-              <w:t>Homework</w:t>
+              <w:t>Homeworks (1–6)+ Midterm examination (counts as two HW)</w:t>
             </w:r>
             <w:r>
               <w:rPr>
                 <w:sz w:val="17"/>
               </w:rPr>
-              <w:t>s</w:t>
+              <w:t/>
             </w:r>
             <w:proofErr w:type="spellEnd"/>
             <w:r>
               <w:rPr>
                 <w:sz w:val="17"/>
               </w:rPr>
-              <w:t xml:space="preserve"> </w:t>
+              <w:t xml:space="preserve"/>
             </w:r>
             <w:r>
               <w:rPr>
                 <w:sz w:val="17"/>
               </w:rPr>
-              <w:t>(</w:t>
+              <w:t/>
             </w:r>
             <w:r>
               <w:rPr>
                 <w:sz w:val="17"/>
               </w:rPr>
-              <w:t>1–6</w:t>
+              <w:t/>
             </w:r>
             <w:r>
               <w:rPr>
                 <w:sz w:val="17"/>
               </w:rPr>
-              <w:t>)+ Midterm examination (counts as two HW)</w:t>
+              <w:t/>
             </w:r>
           </w:p>
         </w:tc>
@@ -2524,19 +2524,19 @@
               <w:rPr>
                 <w:sz w:val="17"/>
               </w:rPr>
-              <w:t>8</w:t>
+              <w:t>8× 8.75% </w:t>
             </w:r>
             <w:r>
               <w:rPr>
                 <w:sz w:val="17"/>
               </w:rPr>
-              <w:t>× 8.75%</w:t>
+              <w:t/>
             </w:r>
             <w:r>
               <w:rPr>
                 <w:sz w:val="17"/>
               </w:rPr>
-              <w:t xml:space="preserve"> </w:t>
+              <w:t xml:space="preserve"/>
             </w:r>
           </w:p>
         </w:tc>
@@ -2561,13 +2561,13 @@
               <w:rPr>
                 <w:sz w:val="17"/>
               </w:rPr>
-              <w:t>70</w:t>
+              <w:t>70%</w:t>
             </w:r>
             <w:r>
               <w:rPr>
                 <w:sz w:val="17"/>
               </w:rPr>
-              <w:t>%</w:t>
+              <w:t/>
             </w:r>
           </w:p>
         </w:tc>
@@ -2767,7 +2767,7 @@
         <w:rPr>
           <w:sz w:val="18"/>
         </w:rPr>
-        <w:t>Unless a handout specifies otherwise, each homework submission is individual and contains the following artifacts. HW 2B requires only one PDF with analytical solutions and software comparisons:</w:t>
+        <w:t>Unless a handout specifies otherwise, each homework submission is individual and contains the following artifacts. HW 3 requires only one PDF with analytical solutions and software comparisons:</w:t>
       </w:r>
     </w:p>
     <w:p>
@@ -2795,25 +2795,25 @@
         <w:rPr>
           <w:sz w:val="17"/>
         </w:rPr>
-        <w:t xml:space="preserve">2. One-slide Claim-Evidence-Check brief (.pptx and exported .pdf): </w:t>
+        <w:t xml:space="preserve">2. One-slide Claim-Evidence-Check brief (.pptx and exported .pdf): briefly describe the problems you solved in that HW. The slide is a synthesis, not a screenshot collage.</w:t>
       </w:r>
       <w:r>
         <w:rPr>
           <w:sz w:val="17"/>
         </w:rPr>
-        <w:t>briefly describe t</w:t>
+        <w:t/>
       </w:r>
       <w:r>
         <w:rPr>
           <w:sz w:val="17"/>
         </w:rPr>
-        <w:t>he problems you solved in that HW</w:t>
+        <w:t/>
       </w:r>
       <w:r>
         <w:rPr>
           <w:sz w:val="17"/>
         </w:rPr>
-        <w:t>. The slide is a synthesis, not a screenshot collage.</w:t>
+        <w:t/>
       </w:r>
     </w:p>
     <w:p>
@@ -2827,31 +2827,31 @@
         <w:rPr>
           <w:sz w:val="17"/>
         </w:rPr>
-        <w:t>3</w:t>
+        <w:t>3. Process and AI note: Explain how you used AI in answering the HW.</w:t>
       </w:r>
       <w:r>
         <w:rPr>
           <w:sz w:val="17"/>
         </w:rPr>
-        <w:t xml:space="preserve">. Process and AI note: </w:t>
+        <w:t xml:space="preserve"/>
       </w:r>
       <w:r>
         <w:rPr>
           <w:sz w:val="17"/>
         </w:rPr>
-        <w:t xml:space="preserve">Explain how you used AI in </w:t>
+        <w:t xml:space="preserve"/>
       </w:r>
       <w:r>
         <w:rPr>
           <w:sz w:val="17"/>
         </w:rPr>
-        <w:t>answering</w:t>
+        <w:t/>
       </w:r>
       <w:r>
         <w:rPr>
           <w:sz w:val="17"/>
         </w:rPr>
-        <w:t xml:space="preserve"> the HW.</w:t>
+        <w:t xml:space="preserve"/>
       </w:r>
     </w:p>
     <w:p>
@@ -3772,9 +3772,9 @@
               <w:rPr>
                 <w:b/>
               </w:rPr>
-              <w:t>Design intent</w:t>
+              <w:t>Design intentBuild and verify one code-generated, non-flying wing; inspect the completed team wing without contact and without load using calibrated machine vision; and interpret a shared before/after-damage demonstration on a separate sacrificial wing-box specimen. Success requires traceable geometry, manufacturing evidence, measurement agreement and uncertainty, physically plausible diagnostic trends, and a defensible engineering decision.</w:t>
               <w:br/>
-              <w:t>Build and verify one code-generated, non-flying wing; inspect the completed team wing without contact and without load using calibrated machine vision; and interpret a shared before/after-damage demonstration on a separate sacrificial wing-box specimen. Success requires traceable geometry, manufacturing evidence, measurement agreement and uncertainty, physically plausible diagnostic trends, and a defensible engineering decision.</w:t>
+              <w:t/>
             </w:r>
           </w:p>
         </w:tc>
@@ -4411,13 +4411,13 @@
         <w:jc w:val="both"/>
       </w:pPr>
       <w:r>
-        <w:t xml:space="preserve">Project grading (30% of </w:t>
-      </w:r>
-      <w:r>
-        <w:t xml:space="preserve">the </w:t>
-      </w:r>
-      <w:r>
-        <w:t>course)</w:t>
+        <w:t xml:space="preserve">Project grading (30% of the course)</w:t>
+      </w:r>
+      <w:r>
+        <w:t xml:space="preserve"/>
+      </w:r>
+      <w:r>
+        <w:t/>
       </w:r>
     </w:p>
     <w:tbl>
@@ -5689,10 +5689,10 @@
         <w:rPr>
           <w:b/>
         </w:rPr>
-        <w:t xml:space="preserve">Team-wing inspection (required). </w:t>
-      </w:r>
-      <w:r>
-        <w:t>Place the unloaded assembled wing in the alignment jig with ruler and ArUco/checkerboard references. Use the shared Jetson Orin Nano, Logitech webcam, camera stand, and instructor-provided Python/OpenCV workflow to estimate semi-span, root/tip chord, seams, and gross alignment. Compare against ruler and digital-caliper measurements and submit calibration evidence, one annotated image, a CSV/log, differences, uncertainty, and at least one identified failure mode.</w:t>
+        <w:t xml:space="preserve">Team-wing inspection (required). Place the unloaded assembled wing in the alignment jig with ruler and ArUco/checkerboard references. Use the shared Jetson Orin Nano, Logitech webcam, camera stand, and instructor-provided Python/OpenCV workflow to estimate semi-span, root/tip chord, seams, and gross alignment. Compare against ruler and digital-caliper measurements and submit calibration evidence, one annotated image, a CSV/log, differences, uncertainty, and at least one identified failure mode.</w:t>
+      </w:r>
+      <w:r>
+        <w:t/>
       </w:r>
     </w:p>
     <w:p>
@@ -5706,10 +5706,10 @@
         <w:rPr>
           <w:b/>
         </w:rPr>
-        <w:t xml:space="preserve">Shared structural-health-monitoring demonstration (required analysis). </w:t>
-      </w:r>
-      <w:r>
-        <w:t>Using a separate sacrificial 3D-printed wing-box specimen, the instructor/TA will acquire force with the 10 kg load cell and HX711, camera-based tip deflection, ADXL343 acceleration, and USB-microscope crack images before and after controlled damage. Teams will compute or interpret stiffness from the force-deflection slope, dominant natural frequency from the acceleration record, and qualitative crack change; then decide which indicators provide credible evidence of damage and which do not.</w:t>
+        <w:t xml:space="preserve">Shared structural-health-monitoring demonstration (required analysis). Using a separate sacrificial 3D-printed wing-box specimen, the instructor/TA will acquire force with the 10 kg load cell and HX711, camera-based tip deflection, ADXL343 acceleration, and USB-microscope crack images before and after controlled damage. Teams will compute or interpret stiffness from the force-deflection slope, dominant natural frequency from the acceleration record, and qualitative crack change; then decide which indicators provide credible evidence of damage and which do not.</w:t>
+      </w:r>
+      <w:r>
+        <w:t/>
       </w:r>
     </w:p>
     <w:p>
@@ -5723,10 +5723,10 @@
         <w:rPr>
           <w:b/>
         </w:rPr>
-        <w:t xml:space="preserve">Safety and specimen boundary. </w:t>
-      </w:r>
-      <w:r>
-        <w:t>No submitted team wing will be loaded, cracked, or tested to failure. Controlled damage is introduced only by the instructor on designated sacrificial specimens; loading is slow, clamped, shielded with clear polycarbonate, and performed with required eye protection. Students do not alter the fixture, damage a specimen, or enter the protected loading area without explicit authorization. A failed print or measurement disagreement can support learning when the evidence, likely cause, and one controlled correction are documented; hiding a result or bypassing a design or safety gate is a violation.</w:t>
+        <w:t xml:space="preserve">Safety and specimen boundary. No submitted team wing will be loaded, cracked, or tested to failure. Controlled damage is introduced only by the instructor on designated sacrificial specimens; loading is slow, clamped, shielded with clear polycarbonate, and performed with required eye protection. Students do not alter the fixture, damage a specimen, or enter the protected loading area without explicit authorization. A failed print or measurement disagreement can support learning when the evidence, likely cause, and one controlled correction are documented; hiding a result or bypassing a design or safety gate is a violation.</w:t>
+      </w:r>
+      <w:r>
+        <w:t/>
       </w:r>
     </w:p>
     <w:p>
@@ -7143,14 +7143,14 @@
               <w:rPr>
                 <w:sz w:val="15"/>
               </w:rPr>
-              <w:t>1</w:t>
+              <w:t>1Sept. 8/10</w:t>
             </w:r>
             <w:r>
               <w:rPr>
                 <w:sz w:val="15"/>
               </w:rPr>
               <w:br/>
-              <w:t>Sept. 8/10</w:t>
+              <w:t/>
             </w:r>
           </w:p>
         </w:tc>
@@ -7231,14 +7231,14 @@
               <w:rPr>
                 <w:sz w:val="15"/>
               </w:rPr>
-              <w:t>2</w:t>
+              <w:t>2Sept. 15/17</w:t>
             </w:r>
             <w:r>
               <w:rPr>
                 <w:sz w:val="15"/>
               </w:rPr>
               <w:br/>
-              <w:t>Sept. 15/17</w:t>
+              <w:t/>
             </w:r>
           </w:p>
         </w:tc>
@@ -7319,14 +7319,14 @@
               <w:rPr>
                 <w:sz w:val="15"/>
               </w:rPr>
-              <w:t>3</w:t>
+              <w:t>3Sept. 22/24</w:t>
             </w:r>
             <w:r>
               <w:rPr>
                 <w:sz w:val="15"/>
               </w:rPr>
               <w:br/>
-              <w:t>Sept. 22/24</w:t>
+              <w:t/>
             </w:r>
           </w:p>
         </w:tc>
@@ -7407,14 +7407,14 @@
               <w:rPr>
                 <w:sz w:val="15"/>
               </w:rPr>
-              <w:t>4</w:t>
+              <w:t>4Sept. 29/Oct. 1</w:t>
             </w:r>
             <w:r>
               <w:rPr>
                 <w:sz w:val="15"/>
               </w:rPr>
               <w:br/>
-              <w:t>Sept. 29/Oct. 1</w:t>
+              <w:t/>
             </w:r>
           </w:p>
         </w:tc>
@@ -7495,14 +7495,14 @@
               <w:rPr>
                 <w:sz w:val="15"/>
               </w:rPr>
-              <w:t>5</w:t>
+              <w:t>5Oct. 6/8</w:t>
             </w:r>
             <w:r>
               <w:rPr>
                 <w:sz w:val="15"/>
               </w:rPr>
               <w:br/>
-              <w:t>Oct. 6/8</w:t>
+              <w:t/>
             </w:r>
           </w:p>
         </w:tc>
@@ -7583,14 +7583,14 @@
               <w:rPr>
                 <w:sz w:val="15"/>
               </w:rPr>
-              <w:t>6</w:t>
+              <w:t>6Oct. 13/15</w:t>
             </w:r>
             <w:r>
               <w:rPr>
                 <w:sz w:val="15"/>
               </w:rPr>
               <w:br/>
-              <w:t>Oct. 13/15</w:t>
+              <w:t/>
             </w:r>
           </w:p>
         </w:tc>
@@ -7671,14 +7671,14 @@
               <w:rPr>
                 <w:sz w:val="15"/>
               </w:rPr>
-              <w:t>7</w:t>
+              <w:t>7Oct. 20/22</w:t>
             </w:r>
             <w:r>
               <w:rPr>
                 <w:sz w:val="15"/>
               </w:rPr>
               <w:br/>
-              <w:t>Oct. 20/22</w:t>
+              <w:t/>
             </w:r>
           </w:p>
         </w:tc>
@@ -7759,14 +7759,14 @@
               <w:rPr>
                 <w:sz w:val="15"/>
               </w:rPr>
-              <w:t>8</w:t>
+              <w:t>8Oct. 27/29</w:t>
             </w:r>
             <w:r>
               <w:rPr>
                 <w:sz w:val="15"/>
               </w:rPr>
               <w:br/>
-              <w:t>Oct. 27/29</w:t>
+              <w:t/>
             </w:r>
           </w:p>
         </w:tc>
@@ -7847,14 +7847,14 @@
               <w:rPr>
                 <w:sz w:val="15"/>
               </w:rPr>
-              <w:t>9</w:t>
+              <w:t>9Nov. 3/5</w:t>
             </w:r>
             <w:r>
               <w:rPr>
                 <w:sz w:val="15"/>
               </w:rPr>
               <w:br/>
-              <w:t>Nov. 3/5</w:t>
+              <w:t/>
             </w:r>
           </w:p>
         </w:tc>
@@ -7904,7 +7904,7 @@
               <w:rPr>
                 <w:sz w:val="15"/>
               </w:rPr>
-              <w:t>HW 2B (three beam cases, 65 points) due Nov. 5.</w:t>
+              <w:t>HW 3 (three beam cases, 65 points) due Nov. 5.</w:t>
             </w:r>
           </w:p>
         </w:tc>
@@ -7935,14 +7935,14 @@
               <w:rPr>
                 <w:sz w:val="15"/>
               </w:rPr>
-              <w:t>10</w:t>
+              <w:t>10Nov. 10/12</w:t>
             </w:r>
             <w:r>
               <w:rPr>
                 <w:sz w:val="15"/>
               </w:rPr>
               <w:br/>
-              <w:t>Nov. 10/12</w:t>
+              <w:t/>
             </w:r>
           </w:p>
         </w:tc>
@@ -7992,7 +7992,7 @@
               <w:rPr>
                 <w:sz w:val="15"/>
               </w:rPr>
-              <w:t>HW 3 due Nov. 12; design and assembly review.</w:t>
+              <w:t>Design and assembly review.</w:t>
             </w:r>
           </w:p>
         </w:tc>
@@ -8023,14 +8023,14 @@
               <w:rPr>
                 <w:sz w:val="15"/>
               </w:rPr>
-              <w:t>11</w:t>
+              <w:t>11Nov. 17/19</w:t>
             </w:r>
             <w:r>
               <w:rPr>
                 <w:sz w:val="15"/>
               </w:rPr>
               <w:br/>
-              <w:t>Nov. 17/19</w:t>
+              <w:t/>
             </w:r>
           </w:p>
         </w:tc>
@@ -8111,14 +8111,14 @@
               <w:rPr>
                 <w:sz w:val="15"/>
               </w:rPr>
-              <w:t>12</w:t>
+              <w:t>12Nov. 24/26</w:t>
             </w:r>
             <w:r>
               <w:rPr>
                 <w:sz w:val="15"/>
               </w:rPr>
               <w:br/>
-              <w:t>Nov. 24/26</w:t>
+              <w:t/>
             </w:r>
           </w:p>
         </w:tc>
@@ -8199,14 +8199,14 @@
               <w:rPr>
                 <w:sz w:val="15"/>
               </w:rPr>
-              <w:t>13</w:t>
+              <w:t>13Dec. 1/3</w:t>
             </w:r>
             <w:r>
               <w:rPr>
                 <w:sz w:val="15"/>
               </w:rPr>
               <w:br/>
-              <w:t>Dec. 1/3</w:t>
+              <w:t/>
             </w:r>
           </w:p>
         </w:tc>
@@ -8287,14 +8287,14 @@
               <w:rPr>
                 <w:sz w:val="15"/>
               </w:rPr>
-              <w:t>14</w:t>
+              <w:t>14Dec. 8/10</w:t>
             </w:r>
             <w:r>
               <w:rPr>
                 <w:sz w:val="15"/>
               </w:rPr>
               <w:br/>
-              <w:t>Dec. 8/10</w:t>
+              <w:t/>
             </w:r>
           </w:p>
         </w:tc>
@@ -8375,14 +8375,14 @@
               <w:rPr>
                 <w:sz w:val="15"/>
               </w:rPr>
-              <w:t>15</w:t>
+              <w:t>15Dec. 15</w:t>
             </w:r>
             <w:r>
               <w:rPr>
                 <w:sz w:val="15"/>
               </w:rPr>
               <w:br/>
-              <w:t>Dec. 15</w:t>
+              <w:t/>
             </w:r>
           </w:p>
         </w:tc>
@@ -8686,7 +8686,7 @@
               <w:rPr>
                 <w:sz w:val="16"/>
               </w:rPr>
-              <w:t>HW 2A: Lilienthal evidence and side-force geometry (35 points). HW 2B: reactions and support displacement/rotation for three distributed-load beams, analytically and with software (65 points).</w:t>
+              <w:t>HW 2A: Lilienthal evidence and side-force geometry (35 points).</w:t>
             </w:r>
           </w:p>
         </w:tc>
@@ -8711,7 +8711,7 @@
               <w:rPr>
                 <w:sz w:val="16"/>
               </w:rPr>
-              <w:t>HW 2A: Oct. 20; HW 2B: Nov. 5, 2026</w:t>
+              <w:t>Oct. 20, 2026</w:t>
             </w:r>
           </w:p>
         </w:tc>
@@ -8767,7 +8767,7 @@
               <w:rPr>
                 <w:sz w:val="16"/>
               </w:rPr>
-              <w:t>Verify independently: wing-beam shear/moment, bending, deflection, strain energy, limiting/alternate check</w:t>
+              <w:t>Three distributed-load beams: reactions, compatibility and selected displacement/rotation, analytically and with software (65 points).</w:t>
             </w:r>
           </w:p>
         </w:tc>
@@ -8792,7 +8792,7 @@
               <w:rPr>
                 <w:sz w:val="16"/>
               </w:rPr>
-              <w:t>Nov. 12</w:t>
+              <w:t>Nov. 5, 2026</w:t>
             </w:r>
           </w:p>
         </w:tc>
@@ -9076,10 +9076,10 @@
         <w:jc w:val="both"/>
       </w:pPr>
       <w:r>
-        <w:t>I do not perform presence check every class, but r</w:t>
-      </w:r>
-      <w:r>
-        <w:t>egular attendance is expected because studios, oral checks, design reviews, speaker events, and safety training cannot be reconstructed fully from slides. Notify the instructor as early as practicable for illness, emergency, military duty, religious observance, disability-related needs, or another University-recognized absence. Approved absences receive a reasonable equivalent activity or make-up without penalty. Students remain responsible for announcements and for coordinating team handoffs.</w:t>
+        <w:t>I do not perform presence check every class, but regular attendance is expected because studios, oral checks, design reviews, speaker events, and safety training cannot be reconstructed fully from slides. Notify the instructor as early as practicable for illness, emergency, military duty, religious observance, disability-related needs, or another University-recognized absence. Approved absences receive a reasonable equivalent activity or make-up without penalty. Students remain responsible for announcements and for coordinating team handoffs.</w:t>
+      </w:r>
+      <w:r>
+        <w:t/>
       </w:r>
     </w:p>
     <w:p>
@@ -9098,13 +9098,13 @@
         <w:jc w:val="both"/>
       </w:pPr>
       <w:r>
-        <w:t xml:space="preserve">Each student may use two </w:t>
-      </w:r>
-      <w:r>
-        <w:t>24</w:t>
-      </w:r>
-      <w:r>
-        <w:t>-hour homework extensions during the semester without giving a reason. The passes do not apply to the midterm, oral rotation, project safety gates, printer reservations, fabrication/assembly appointments, or the final presentation. Beyond the passes, late individual work loses 10% of the earned score per 24 hours unless an approved circumstance or accommodation applies. Contact the instructor before a project deadline whenever possible; team safety and printer capacity may require an alternate deliverable rather than a shifted machine slot.</w:t>
+        <w:t xml:space="preserve">Each student may use two 24-hour homework extensions during the semester without giving a reason. The passes do not apply to the midterm, oral rotation, project safety gates, printer reservations, fabrication/assembly appointments, or the final presentation. Beyond the passes, late individual work loses 10% of the earned score per 24 hours unless an approved circumstance or accommodation applies. Contact the instructor before a project deadline whenever possible; team safety and printer capacity may require an alternate deliverable rather than a shifted machine slot.</w:t>
+      </w:r>
+      <w:r>
+        <w:t/>
+      </w:r>
+      <w:r>
+        <w:t/>
       </w:r>
     </w:p>
     <w:p>
@@ -9123,18 +9123,18 @@
         <w:jc w:val="both"/>
       </w:pPr>
       <w:r>
-        <w:t xml:space="preserve">Students are entitled to reasonable accommodation for religious observances. Review the schedule early and notify the instructor so an alternative can be arranged without penalty. See the </w:t>
+        <w:t xml:space="preserve">Students are entitled to reasonable accommodation for religious observances. Review the schedule early and notify the instructor so an alternative can be arranged without penalty. See the UMass Academic Regulations.</w:t>
       </w:r>
       <w:hyperlink r:id="rId8">
         <w:r>
           <w:rPr>
             <w:u w:val="single"/>
           </w:rPr>
-          <w:t>UMass Academic Regulations</w:t>
+          <w:t/>
         </w:r>
       </w:hyperlink>
       <w:r>
-        <w:t>.</w:t>
+        <w:t/>
       </w:r>
     </w:p>
     <w:p>
@@ -9161,18 +9161,18 @@
         <w:jc w:val="both"/>
       </w:pPr>
       <w:r>
-        <w:t xml:space="preserve">The University Academic Integrity Policy applies to all work: </w:t>
+        <w:t xml:space="preserve">The University Academic Integrity Policy applies to all work: UMass Academic Integrity Policy. Suspected violations follow University procedures.</w:t>
       </w:r>
       <w:hyperlink r:id="rId9">
         <w:r>
           <w:rPr>
             <w:u w:val="single"/>
           </w:rPr>
-          <w:t>UMass Academic Integrity Policy</w:t>
+          <w:t/>
         </w:r>
       </w:hyperlink>
       <w:r>
-        <w:t>. Suspected violations follow University procedures.</w:t>
+        <w:t/>
       </w:r>
     </w:p>
     <w:p>
@@ -9547,13 +9547,13 @@
         <w:jc w:val="both"/>
       </w:pPr>
       <w:r>
-        <w:t xml:space="preserve">Submit a concise written regrade request within </w:t>
-      </w:r>
-      <w:r>
-        <w:t>two</w:t>
-      </w:r>
-      <w:r>
-        <w:t xml:space="preserve"> calendar days of the grade posting. Identify the specific rubric item and evidence; do not ask only for additional points. The complete submission may be reviewed, and the score may increase, remain unchanged, or decrease if another material grading error is found.</w:t>
+        <w:t xml:space="preserve">Submit a concise written regrade request within two calendar days of the grade posting. Identify the specific rubric item and evidence; do not ask only for additional points. The complete submission may be reviewed, and the score may increase, remain unchanged, or decrease if another material grading error is found.</w:t>
+      </w:r>
+      <w:r>
+        <w:t/>
+      </w:r>
+      <w:r>
+        <w:t xml:space="preserve"/>
       </w:r>
     </w:p>
     <w:p>
@@ -9603,18 +9603,18 @@
         <w:jc w:val="both"/>
       </w:pPr>
       <w:r>
-        <w:t xml:space="preserve">UMass Amherst is committed to equal educational access. Students who need an accommodation should connect with Disability Services and provide the course accommodation notice as early as possible. Accommodations apply to classrooms, assessments, oral alternatives, and project/lab access. </w:t>
+        <w:t xml:space="preserve">UMass Amherst is committed to equal educational access. Students who need an accommodation should connect with Disability Services and provide the course accommodation notice as early as possible. Accommodations apply to classrooms, assessments, oral alternatives, and project/lab access. Disability Services.</w:t>
       </w:r>
       <w:hyperlink r:id="rId10">
         <w:r>
           <w:rPr>
             <w:u w:val="single"/>
           </w:rPr>
-          <w:t>Disability Services</w:t>
+          <w:t/>
         </w:r>
       </w:hyperlink>
       <w:r>
-        <w:t>.</w:t>
+        <w:t/>
       </w:r>
     </w:p>
     <w:p>
@@ -9644,21 +9644,21 @@
         <w:rPr>
           <w:sz w:val="18"/>
         </w:rPr>
-        <w:t xml:space="preserve">Required statements: </w:t>
+        <w:t xml:space="preserve">Required statements: UMass Faculty Senate - Non-Responsible Employee Required Syllabus Statements. This page contains the current Academic Integrity, Accommodation, and Title IX statements incorporated into this syllabus by reference.</w:t>
       </w:r>
       <w:hyperlink r:id="rId11">
         <w:r>
           <w:rPr>
             <w:u w:val="single"/>
           </w:rPr>
-          <w:t>UMass Faculty Senate - Non-Responsible Employee Required Syllabus Statements</w:t>
+          <w:t/>
         </w:r>
       </w:hyperlink>
       <w:r>
         <w:rPr>
           <w:sz w:val="18"/>
         </w:rPr>
-        <w:t>. This page contains the current Academic Integrity, Accommodation, and Title IX statements incorporated into this syllabus by reference.</w:t>
+        <w:t/>
       </w:r>
     </w:p>
     <w:p>
@@ -9677,18 +9677,18 @@
         <w:jc w:val="both"/>
       </w:pPr>
       <w:r>
-        <w:t xml:space="preserve">Coursework and life demands can become difficult. Contact the instructor early when circumstances affect participation, and use campus support. Confidential mental-health services are available through the </w:t>
+        <w:t xml:space="preserve">Coursework and life demands can become difficult. Contact the instructor early when circumstances affect participation, and use campus support. Confidential mental-health services are available through the Center for Counseling and Psychological Health. In an immediate emergency, call 911 or use the University’s emergency resources.</w:t>
       </w:r>
       <w:hyperlink r:id="rId12">
         <w:r>
           <w:rPr>
             <w:u w:val="single"/>
           </w:rPr>
-          <w:t>Center for Counseling and Psychological Health</w:t>
+          <w:t/>
         </w:r>
       </w:hyperlink>
       <w:r>
-        <w:t>. In an immediate emergency, call 911 or use the University’s emergency resources.</w:t>
+        <w:t/>
       </w:r>
     </w:p>
     <w:p>
@@ -9750,7 +9750,7 @@
         <w:rPr>
           <w:sz w:val="18"/>
         </w:rPr>
-        <w:t xml:space="preserve">• </w:t>
+        <w:t xml:space="preserve">• UMass syllabus requirements</w:t>
       </w:r>
       <w:hyperlink r:id="rId13">
         <w:r>
@@ -9758,7 +9758,7 @@
             <w:sz w:val="18"/>
             <w:u w:val="single"/>
           </w:rPr>
-          <w:t>UMass syllabus requirements</w:t>
+          <w:t/>
         </w:r>
       </w:hyperlink>
     </w:p>
@@ -9772,7 +9772,7 @@
         <w:rPr>
           <w:sz w:val="18"/>
         </w:rPr>
-        <w:t xml:space="preserve">• </w:t>
+        <w:t xml:space="preserve">• Academic Integrity Policy</w:t>
       </w:r>
       <w:hyperlink r:id="rId14">
         <w:r>
@@ -9780,7 +9780,7 @@
             <w:sz w:val="18"/>
             <w:u w:val="single"/>
           </w:rPr>
-          <w:t>Academic Integrity Policy</w:t>
+          <w:t/>
         </w:r>
       </w:hyperlink>
     </w:p>
@@ -9794,7 +9794,7 @@
         <w:rPr>
           <w:sz w:val="18"/>
         </w:rPr>
-        <w:t xml:space="preserve">• </w:t>
+        <w:t xml:space="preserve">• Responsible use of generative AI</w:t>
       </w:r>
       <w:hyperlink r:id="rId15">
         <w:r>
@@ -9802,7 +9802,7 @@
             <w:sz w:val="18"/>
             <w:u w:val="single"/>
           </w:rPr>
-          <w:t>Responsible use of generative AI</w:t>
+          <w:t/>
         </w:r>
       </w:hyperlink>
     </w:p>
@@ -9816,7 +9816,7 @@
         <w:rPr>
           <w:sz w:val="18"/>
         </w:rPr>
-        <w:t xml:space="preserve">• </w:t>
+        <w:t xml:space="preserve">• Courses Extra Credit Policy</w:t>
       </w:r>
       <w:hyperlink r:id="rId16">
         <w:r>
@@ -9824,7 +9824,7 @@
             <w:sz w:val="18"/>
             <w:u w:val="single"/>
           </w:rPr>
-          <w:t>Courses Extra Credit Policy</w:t>
+          <w:t/>
         </w:r>
       </w:hyperlink>
     </w:p>
@@ -9838,7 +9838,7 @@
         <w:rPr>
           <w:sz w:val="18"/>
         </w:rPr>
-        <w:t xml:space="preserve">• </w:t>
+        <w:t xml:space="preserve">• Registrar Academic Calendar</w:t>
       </w:r>
       <w:hyperlink r:id="rId17">
         <w:r>
@@ -9846,7 +9846,7 @@
             <w:sz w:val="18"/>
             <w:u w:val="single"/>
           </w:rPr>
-          <w:t>Registrar Academic Calendar</w:t>
+          <w:t/>
         </w:r>
       </w:hyperlink>
     </w:p>

</xml_diff>